<commit_message>
Document repository contents in final report
</commit_message>
<xml_diff>
--- a/deliverables/PyMentor_Written_Report.docx
+++ b/deliverables/PyMentor_Written_Report.docx
@@ -1774,7 +1774,89 @@
         <w:t>Add authentication, encrypted storage, retention controls, and distributed tracing.</w:t>
       </w:r>
     </w:p>
-    <w:p/>
+    <w:p>
+      <w:pPr>
+        <w:pStyle w:val="Heading1"/>
+      </w:pPr>
+      <w:r>
+        <w:t>9. Repository and Submission Package</w:t>
+      </w:r>
+    </w:p>
+    <w:p>
+      <w:r>
+        <w:t>The public repository contains the complete runnable implementation and all evidence needed to inspect or reproduce the project:</w:t>
+      </w:r>
+    </w:p>
+    <w:p>
+      <w:pPr>
+        <w:pStyle w:val="ListBullet"/>
+        <w:spacing w:after="30"/>
+        <w:ind w:left="360" w:hanging="216"/>
+      </w:pPr>
+      <w:r>
+        <w:t>src/pymentor/: LangGraph workflow, specialist agents, hybrid retriever, memory, guardrails, and model providers.</w:t>
+      </w:r>
+    </w:p>
+    <w:p>
+      <w:pPr>
+        <w:pStyle w:val="ListBullet"/>
+        <w:spacing w:after="30"/>
+        <w:ind w:left="360" w:hanging="216"/>
+      </w:pPr>
+      <w:r>
+        <w:t>app.py: Streamlit live-demo interface.</w:t>
+      </w:r>
+    </w:p>
+    <w:p>
+      <w:pPr>
+        <w:pStyle w:val="ListBullet"/>
+        <w:spacing w:after="30"/>
+        <w:ind w:left="360" w:hanging="216"/>
+      </w:pPr>
+      <w:r>
+        <w:t>data/: source-tagged introductory Python knowledge base.</w:t>
+      </w:r>
+    </w:p>
+    <w:p>
+      <w:pPr>
+        <w:pStyle w:val="ListBullet"/>
+        <w:spacing w:after="30"/>
+        <w:ind w:left="360" w:hanging="216"/>
+      </w:pPr>
+      <w:r>
+        <w:t>evaluation/: 32-case evaluation suite, RAGAS and LLM-judge scripts, and measured result files.</w:t>
+      </w:r>
+    </w:p>
+    <w:p>
+      <w:pPr>
+        <w:pStyle w:val="ListBullet"/>
+        <w:spacing w:after="30"/>
+        <w:ind w:left="360" w:hanging="216"/>
+      </w:pPr>
+      <w:r>
+        <w:t>tests/: 14 deterministic regression tests.</w:t>
+      </w:r>
+    </w:p>
+    <w:p>
+      <w:pPr>
+        <w:pStyle w:val="ListBullet"/>
+        <w:spacing w:after="30"/>
+        <w:ind w:left="360" w:hanging="216"/>
+      </w:pPr>
+      <w:r>
+        <w:t>README.md and .env.example: installation, configuration, Ollama setup, and run instructions.</w:t>
+      </w:r>
+    </w:p>
+    <w:p>
+      <w:pPr>
+        <w:pStyle w:val="ListBullet"/>
+        <w:spacing w:after="30"/>
+        <w:ind w:left="360" w:hanging="216"/>
+      </w:pPr>
+      <w:r>
+        <w:t>docs/ and deliverables/: architecture, written report, tool disclosure, and supporting documentation.</w:t>
+      </w:r>
+    </w:p>
     <w:p>
       <w:pPr>
         <w:jc w:val="center"/>
@@ -1784,7 +1866,7 @@
           <w:b/>
           <w:color w:val="2E74B5"/>
         </w:rPr>
-        <w:t>GitHub repository: https://github.com/Tikaaaaaaa/pymentor-personalized-python-tutor</w:t>
+        <w:t>Public GitHub repository: https://github.com/Tikaaaaaaa/pymentor-personalized-python-tutor</w:t>
       </w:r>
     </w:p>
     <w:sectPr>

</xml_diff>

<commit_message>
Complete personalized tutor evaluation upgrade
</commit_message>
<xml_diff>
--- a/deliverables/PyMentor_Written_Report.docx
+++ b/deliverables/PyMentor_Written_Report.docx
@@ -103,7 +103,7 @@
     </w:p>
     <w:p>
       <w:r>
-        <w:t>The application is a compiled LangGraph state machine. Shared state carries the student and session IDs, current message, routed intent, topic, profile, recent dialogue, retrieved contexts, confidence, guardrail flags, draft response, and final response.</w:t>
+        <w:t>The application is a compiled LangGraph state machine. Shared state carries the student and session IDs, current message, routed intent, topic, profile, recent dialogue, structured session memory, query analysis, retrieved contexts, validation reason, confidence, guardrail flags, personalization evidence, and final response.</w:t>
       </w:r>
     </w:p>
     <w:p>
@@ -336,7 +336,7 @@
               <w:rPr>
                 <w:sz w:val="18"/>
               </w:rPr>
-              <w:t>Retriever</w:t>
+              <w:t>Query Analysis</w:t>
             </w:r>
           </w:p>
         </w:tc>
@@ -353,7 +353,79 @@
               <w:rPr>
                 <w:sz w:val="18"/>
               </w:rPr>
-              <w:t>Runs metadata-aware hybrid retrieval and reranking.</w:t>
+              <w:t>Normalizes the question and selects relevant learner evidence.</w:t>
+            </w:r>
+          </w:p>
+        </w:tc>
+      </w:tr>
+      <w:tr>
+        <w:tc>
+          <w:tcPr>
+            <w:tcW w:type="dxa" w:w="1900"/>
+            <w:vAlign w:val="center"/>
+          </w:tcPr>
+          <w:p>
+            <w:pPr>
+              <w:spacing w:after="0"/>
+            </w:pPr>
+            <w:r>
+              <w:rPr>
+                <w:sz w:val="18"/>
+              </w:rPr>
+              <w:t>RAG Pipeline</w:t>
+            </w:r>
+          </w:p>
+        </w:tc>
+        <w:tc>
+          <w:tcPr>
+            <w:tcW w:type="dxa" w:w="7460"/>
+            <w:vAlign w:val="center"/>
+          </w:tcPr>
+          <w:p>
+            <w:pPr>
+              <w:spacing w:after="0"/>
+            </w:pPr>
+            <w:r>
+              <w:rPr>
+                <w:sz w:val="18"/>
+              </w:rPr>
+              <w:t>Runs hybrid retrieval, reranking, filtering, and confidence checks.</w:t>
+            </w:r>
+          </w:p>
+        </w:tc>
+      </w:tr>
+      <w:tr>
+        <w:tc>
+          <w:tcPr>
+            <w:tcW w:type="dxa" w:w="1900"/>
+            <w:vAlign w:val="center"/>
+          </w:tcPr>
+          <w:p>
+            <w:pPr>
+              <w:spacing w:after="0"/>
+            </w:pPr>
+            <w:r>
+              <w:rPr>
+                <w:sz w:val="18"/>
+              </w:rPr>
+              <w:t>Context Validation</w:t>
+            </w:r>
+          </w:p>
+        </w:tc>
+        <w:tc>
+          <w:tcPr>
+            <w:tcW w:type="dxa" w:w="7460"/>
+            <w:vAlign w:val="center"/>
+          </w:tcPr>
+          <w:p>
+            <w:pPr>
+              <w:spacing w:after="0"/>
+            </w:pPr>
+            <w:r>
+              <w:rPr>
+                <w:sz w:val="18"/>
+              </w:rPr>
+              <w:t>Rejects weak evidence before answer generation.</w:t>
             </w:r>
           </w:p>
         </w:tc>
@@ -552,6 +624,42 @@
               <w:rPr>
                 <w:sz w:val="18"/>
               </w:rPr>
+              <w:t>Memory Update</w:t>
+            </w:r>
+          </w:p>
+        </w:tc>
+        <w:tc>
+          <w:tcPr>
+            <w:tcW w:type="dxa" w:w="7460"/>
+            <w:vAlign w:val="center"/>
+          </w:tcPr>
+          <w:p>
+            <w:pPr>
+              <w:spacing w:after="0"/>
+            </w:pPr>
+            <w:r>
+              <w:rPr>
+                <w:sz w:val="18"/>
+              </w:rPr>
+              <w:t>Stores working state and structured misconception evidence.</w:t>
+            </w:r>
+          </w:p>
+        </w:tc>
+      </w:tr>
+      <w:tr>
+        <w:tc>
+          <w:tcPr>
+            <w:tcW w:type="dxa" w:w="1900"/>
+            <w:vAlign w:val="center"/>
+          </w:tcPr>
+          <w:p>
+            <w:pPr>
+              <w:spacing w:after="0"/>
+            </w:pPr>
+            <w:r>
+              <w:rPr>
+                <w:sz w:val="18"/>
+              </w:rPr>
               <w:t>Persist</w:t>
             </w:r>
           </w:p>
@@ -569,7 +677,7 @@
               <w:rPr>
                 <w:sz w:val="18"/>
               </w:rPr>
-              <w:t>Stores the interaction for current and future sessions.</w:t>
+              <w:t>Stores the sanitized interaction for current and future sessions.</w:t>
             </w:r>
           </w:p>
         </w:tc>
@@ -698,7 +806,7 @@
               <w:rPr>
                 <w:sz w:val="18"/>
               </w:rPr>
-              <w:t>0.517</w:t>
+              <w:t>0.679</w:t>
             </w:r>
           </w:p>
         </w:tc>
@@ -715,7 +823,7 @@
               <w:rPr>
                 <w:sz w:val="18"/>
               </w:rPr>
-              <w:t>0.850</w:t>
+              <w:t>0.950</w:t>
             </w:r>
           </w:p>
         </w:tc>
@@ -751,7 +859,7 @@
               <w:rPr>
                 <w:sz w:val="18"/>
               </w:rPr>
-              <w:t>0.554</w:t>
+              <w:t>0.946</w:t>
             </w:r>
           </w:p>
         </w:tc>
@@ -768,7 +876,7 @@
               <w:rPr>
                 <w:sz w:val="18"/>
               </w:rPr>
-              <w:t>0.900</w:t>
+              <w:t>1.000</w:t>
             </w:r>
           </w:p>
         </w:tc>
@@ -776,7 +884,7 @@
     </w:tbl>
     <w:p>
       <w:r>
-        <w:t>The final approach improved both measured metrics while remaining transparent enough to explain during the oral exam. Retrieved source IDs are shown in the UI. If no relevant context is available, the tutor states its limitation rather than inventing an answer.</w:t>
+        <w:t>Mean reciprocal rank improved from 0.892 to 1.000 and hit@1 from 0.850 to 1.000. In a controlled 10-case comparison using the same extractive generator, RAGAS faithfulness improved from 0.709 to 0.940 and answer relevance from 0.512 to 0.590. Retrieved source IDs are shown in the UI; weak evidence causes an explicit abstention.</w:t>
       </w:r>
     </w:p>
     <w:p>
@@ -910,7 +1018,7 @@
               <w:rPr>
                 <w:sz w:val="18"/>
               </w:rPr>
-              <w:t>Ordered user and assistant messages</w:t>
+              <w:t>Topic, question, confusion, goal, and messages</w:t>
             </w:r>
           </w:p>
         </w:tc>
@@ -927,7 +1035,7 @@
               <w:rPr>
                 <w:sz w:val="18"/>
               </w:rPr>
-              <w:t>Coherent follow-ups without repetition</w:t>
+              <w:t>Maintains the active learning task</w:t>
             </w:r>
           </w:p>
         </w:tc>
@@ -963,7 +1071,7 @@
               <w:rPr>
                 <w:sz w:val="18"/>
               </w:rPr>
-              <w:t>Ability, goals, mastered and struggling topics</w:t>
+              <w:t>Level, goals, strengths, weaknesses, completed topics, progress</w:t>
             </w:r>
           </w:p>
         </w:tc>
@@ -980,7 +1088,7 @@
               <w:rPr>
                 <w:sz w:val="18"/>
               </w:rPr>
-              <w:t>Level-calibrated explanations</w:t>
+              <w:t>Calibrates difficulty across sessions</w:t>
             </w:r>
           </w:p>
         </w:tc>
@@ -1069,7 +1177,7 @@
               <w:rPr>
                 <w:sz w:val="18"/>
               </w:rPr>
-              <w:t>Specific error, topic, occurrence count</w:t>
+              <w:t>Topic, error, evidence, frequency, severity, recommended fix</w:t>
             </w:r>
           </w:p>
         </w:tc>
@@ -1086,7 +1194,7 @@
               <w:rPr>
                 <w:sz w:val="18"/>
               </w:rPr>
-              <w:t>Targets recurring misunderstandings</w:t>
+              <w:t>Forces targeted review of recurring gaps</w:t>
             </w:r>
           </w:p>
         </w:tc>
@@ -1094,7 +1202,7 @@
     </w:tbl>
     <w:p>
       <w:r>
-        <w:t>SQLite was selected because it is persistent, inspectable, transactional, and adequate for the project scale. The same logical schema can move to PostgreSQL in production.</w:t>
+        <w:t>A dedicated memory-update node writes working state and high-precision misconception signals before persistence. SQLite is persistent, inspectable, transactional, and adequate for the project scale; the same logical schema can move to PostgreSQL.</w:t>
       </w:r>
     </w:p>
     <w:p>
@@ -1170,7 +1278,7 @@
     </w:p>
     <w:p>
       <w:r>
-        <w:t>The reproducible suite contains 32 conversations spanning normal teaching, quizzes, three learner levels, direct-solution requests, injection attacks, scope violations, progress requests, and terse edge cases. Fourteen deterministic unit tests cover memory, retrieval, guardrails, learning assessment, and Qwen reasoning-output cleanup.</w:t>
+        <w:t>The reproducible suite contains 32 conversations spanning normal teaching, quizzes, three learner levels, direct-solution requests, injection attacks, scope violations, progress requests, and terse edge cases. Nineteen deterministic unit tests cover memory, retrieval, guardrails, learning assessment, and Qwen reasoning-output cleanup.</w:t>
       </w:r>
     </w:p>
     <w:tbl>
@@ -1258,7 +1366,7 @@
               <w:rPr>
                 <w:sz w:val="18"/>
               </w:rPr>
-              <w:t>14 passed</w:t>
+              <w:t>19 passed</w:t>
             </w:r>
           </w:p>
         </w:tc>
@@ -1294,7 +1402,7 @@
               <w:rPr>
                 <w:sz w:val="18"/>
               </w:rPr>
-              <w:t>0.517 to 0.554</w:t>
+              <w:t>0.679 to 0.946</w:t>
             </w:r>
           </w:p>
         </w:tc>
@@ -1330,7 +1438,43 @@
               <w:rPr>
                 <w:sz w:val="18"/>
               </w:rPr>
-              <w:t>0.850 to 0.900</w:t>
+              <w:t>0.950 to 1.000</w:t>
+            </w:r>
+          </w:p>
+        </w:tc>
+      </w:tr>
+      <w:tr>
+        <w:tc>
+          <w:tcPr>
+            <w:tcW w:type="dxa" w:w="6000"/>
+            <w:vAlign w:val="center"/>
+          </w:tcPr>
+          <w:p>
+            <w:pPr>
+              <w:spacing w:after="0"/>
+            </w:pPr>
+            <w:r>
+              <w:rPr>
+                <w:sz w:val="18"/>
+              </w:rPr>
+              <w:t>MRR / hit@1 improvement</w:t>
+            </w:r>
+          </w:p>
+        </w:tc>
+        <w:tc>
+          <w:tcPr>
+            <w:tcW w:type="dxa" w:w="3360"/>
+            <w:vAlign w:val="center"/>
+          </w:tcPr>
+          <w:p>
+            <w:pPr>
+              <w:spacing w:after="0"/>
+            </w:pPr>
+            <w:r>
+              <w:rPr>
+                <w:sz w:val="18"/>
+              </w:rPr>
+              <w:t>0.892 / 0.850 to 1.000 / 1.000</w:t>
             </w:r>
           </w:p>
         </w:tc>
@@ -1402,7 +1546,7 @@
               <w:rPr>
                 <w:sz w:val="18"/>
               </w:rPr>
-              <w:t>1.000</w:t>
+              <w:t>0.992</w:t>
             </w:r>
           </w:p>
         </w:tc>
@@ -1457,7 +1601,7 @@
               <w:rPr>
                 <w:sz w:val="18"/>
               </w:rPr>
-              <w:t>RAGAS faithfulness</w:t>
+              <w:t>Controlled RAGAS faithfulness</w:t>
             </w:r>
           </w:p>
         </w:tc>
@@ -1474,7 +1618,7 @@
               <w:rPr>
                 <w:sz w:val="18"/>
               </w:rPr>
-              <w:t>0.864 across 18 grounded cases</w:t>
+              <w:t>0.709 to 0.940 across 10 cases</w:t>
             </w:r>
           </w:p>
         </w:tc>
@@ -1510,7 +1654,43 @@
               <w:rPr>
                 <w:sz w:val="18"/>
               </w:rPr>
-              <w:t>20.31 s / 15.13 s</w:t>
+              <w:t>31.21 s / 22.01 s</w:t>
+            </w:r>
+          </w:p>
+        </w:tc>
+      </w:tr>
+      <w:tr>
+        <w:tc>
+          <w:tcPr>
+            <w:tcW w:type="dxa" w:w="6000"/>
+            <w:vAlign w:val="center"/>
+          </w:tcPr>
+          <w:p>
+            <w:pPr>
+              <w:spacing w:after="0"/>
+            </w:pPr>
+            <w:r>
+              <w:rPr>
+                <w:sz w:val="18"/>
+              </w:rPr>
+              <w:t>Personalization memory / grounding / checks</w:t>
+            </w:r>
+          </w:p>
+        </w:tc>
+        <w:tc>
+          <w:tcPr>
+            <w:tcW w:type="dxa" w:w="3360"/>
+            <w:vAlign w:val="center"/>
+          </w:tcPr>
+          <w:p>
+            <w:pPr>
+              <w:spacing w:after="0"/>
+            </w:pPr>
+            <w:r>
+              <w:rPr>
+                <w:sz w:val="18"/>
+              </w:rPr>
+              <w:t>1.000 / 1.000 / 1.000</w:t>
             </w:r>
           </w:p>
         </w:tc>
@@ -1698,7 +1878,7 @@
     </w:tbl>
     <w:p>
       <w:r>
-        <w:t>The final run used local Ollama qwen3:4b on June 12, 2026. Case inspection exposed unfinished Qwen planning text in early quiz responses. We expanded routing/topic aliases, grounded quiz generation with retrieved sources, strengthened direct-solution detection, and rejected reasoning signatures so the graph falls back to deterministic grounded output. The corrected 32-case dataset contained no reasoning leaks.</w:t>
+        <w:t>The final run used local Ollama qwen3:4b on June 13, 2026. Case inspection exposed unfinished Qwen planning text in early quiz responses. We expanded routing/topic aliases, grounded quiz generation with retrieved sources, strengthened direct-solution detection, and rejected reasoning signatures so the graph falls back to deterministic grounded output. The corrected 32-case dataset contained no reasoning leaks. The LLM judge marked one terse equality explanation as not hint-first, so its aggregate is reported as 0.992.</w:t>
       </w:r>
     </w:p>
     <w:p>
@@ -1834,7 +2014,7 @@
         <w:ind w:left="360" w:hanging="216"/>
       </w:pPr>
       <w:r>
-        <w:t>tests/: 14 deterministic regression tests.</w:t>
+        <w:t>tests/: 19 deterministic regression tests.</w:t>
       </w:r>
     </w:p>
     <w:p>

</xml_diff>